<commit_message>
docs: rebuild Vietnamese guide, vendor-neutral config and v7.1.1
Remove the hard-coded model name and legacy ANTHROPIC_* variables; use the
vendor-neutral LLM_PROVIDER/LLM_API_KEY/LLM_MODEL configuration. Update version
to 7.1.1, add the Zenodo DOIs and the current repository URL.

Co-authored-by: Phan Anh Tu <patu@ctu.edu.vn>
</commit_message>
<xml_diff>
--- a/HUONG_DAN_TIENG_VIET.docx
+++ b/HUONG_DAN_TIENG_VIET.docx
@@ -2,13 +2,13 @@
 <file path=word/document.xml><?xml version="1.0" encoding="utf-8"?>
 <w:document xmlns:w="http://schemas.openxmlformats.org/wordprocessingml/2006/main" xmlns:m="http://schemas.openxmlformats.org/officeDocument/2006/math" xmlns:r="http://schemas.openxmlformats.org/officeDocument/2006/relationships" xmlns:o="urn:schemas-microsoft-com:office:office" xmlns:v="urn:schemas-microsoft-com:vml" xmlns:w10="urn:schemas-microsoft-com:office:word" xmlns:a="http://schemas.openxmlformats.org/drawingml/2006/main" xmlns:pic="http://schemas.openxmlformats.org/drawingml/2006/picture" xmlns:wp="http://schemas.openxmlformats.org/drawingml/2006/wordprocessingDrawing">
   <w:body>
-    <w:bookmarkStart w:id="16" w:name="hướng-dẫn-hệ-thống-m-aida-v710"/>
+    <w:bookmarkStart w:id="16" w:name="hướng-dẫn-hệ-thống-m-aida-v711"/>
     <w:p>
       <w:pPr>
         <w:pStyle w:val="Heading1"/>
       </w:pPr>
       <w:r>
-        <w:t xml:space="preserve">HƯỚNG DẪN HỆ THỐNG M-AIDA v7.1.0</w:t>
+        <w:t xml:space="preserve">HƯỚNG DẪN HỆ THỐNG M-AIDA v7.1.1</w:t>
       </w:r>
     </w:p>
     <w:bookmarkStart w:id="9" w:name="meta-analysis-intelligent-data-assistant"/>
@@ -35,7 +35,7 @@
         <w:t xml:space="preserve"> </w:t>
       </w:r>
       <w:r>
-        <w:t xml:space="preserve">Đỗ Thùy Hương (ORCID 0000-0002-7711-2487) và Phan Anh Tú, Trường Đại học Cần Thơ.</w:t>
+        <w:t xml:space="preserve">Đỗ Thùy Hương (ORCID 0000-0002-7711-2487; nghiên cứu sinh) và Phan Anh Tú (ORCID 0000-0003-0667-3137), Trường Kinh tế, Đại học Cần Thơ.</w:t>
       </w:r>
       <w:r>
         <w:t xml:space="preserve"> </w:t>
@@ -173,7 +173,7 @@
               <w:t xml:space="preserve">notion_sync.py</w:t>
             </w:r>
             <w:r>
-              <w:t xml:space="preserve">), lớp engine đa nhà cung cấp (</w:t>
+              <w:t xml:space="preserve">), lớp engine trung lập nhà cung cấp (</w:t>
             </w:r>
             <w:r>
               <w:rPr>
@@ -395,13 +395,37 @@
         <w:rPr>
           <w:rStyle w:val="VerbatimChar"/>
         </w:rPr>
-        <w:t xml:space="preserve">ANTHROPIC_API_KEY</w:t>
-      </w:r>
-      <w:r>
-        <w:t xml:space="preserve"> </w:t>
-      </w:r>
-      <w:r>
-        <w:t xml:space="preserve">(bắt buộc),</w:t>
+        <w:t xml:space="preserve">LLM_PROVIDER</w:t>
+      </w:r>
+      <w:r>
+        <w:t xml:space="preserve">,</w:t>
+      </w:r>
+      <w:r>
+        <w:t xml:space="preserve"> </w:t>
+      </w:r>
+      <w:r>
+        <w:rPr>
+          <w:rStyle w:val="VerbatimChar"/>
+        </w:rPr>
+        <w:t xml:space="preserve">LLM_API_KEY</w:t>
+      </w:r>
+      <w:r>
+        <w:t xml:space="preserve">,</w:t>
+      </w:r>
+      <w:r>
+        <w:t xml:space="preserve"> </w:t>
+      </w:r>
+      <w:r>
+        <w:rPr>
+          <w:rStyle w:val="VerbatimChar"/>
+        </w:rPr>
+        <w:t xml:space="preserve">LLM_MODEL</w:t>
+      </w:r>
+      <w:r>
+        <w:t xml:space="preserve"> </w:t>
+      </w:r>
+      <w:r>
+        <w:t xml:space="preserve">(cấu hình nhà cung cấp mô hình của bạn), cùng</w:t>
       </w:r>
       <w:r>
         <w:t xml:space="preserve"> </w:t>
@@ -431,31 +455,7 @@
         <w:t xml:space="preserve"> </w:t>
       </w:r>
       <w:r>
-        <w:t xml:space="preserve">(tùy chọn, chỉ khi dùng đồng bộ Notion). Model mặc định</w:t>
-      </w:r>
-      <w:r>
-        <w:t xml:space="preserve"> </w:t>
-      </w:r>
-      <w:r>
-        <w:rPr>
-          <w:rStyle w:val="VerbatimChar"/>
-        </w:rPr>
-        <w:t xml:space="preserve">claude-fable-5</w:t>
-      </w:r>
-      <w:r>
-        <w:t xml:space="preserve">; đổi qua biến</w:t>
-      </w:r>
-      <w:r>
-        <w:t xml:space="preserve"> </w:t>
-      </w:r>
-      <w:r>
-        <w:rPr>
-          <w:rStyle w:val="VerbatimChar"/>
-        </w:rPr>
-        <w:t xml:space="preserve">ANTHROPIC_MODEL</w:t>
-      </w:r>
-      <w:r>
-        <w:t xml:space="preserve">.</w:t>
+        <w:t xml:space="preserve">(tùy chọn, chỉ khi dùng đồng bộ Notion). Hệ thống trung lập nhà cung cấp, không gắn với một mô hình cụ thể nào.</w:t>
       </w:r>
     </w:p>
     <w:p>
@@ -704,7 +704,34 @@
         </w:numPr>
       </w:pPr>
       <w:r>
-        <w:t xml:space="preserve">Phiên bản 7.1.0 (09/07/2026): thêm đóng gói pip (PEP 621), bộ kiểm thử pytest, chuyển frontend sang Vite 6, CI GitHub Actions; 7.0.1 (10/06/2026): căn chỉnh schema với cơ sở dữ liệu P6. Chi tiết trong</w:t>
+        <w:t xml:space="preserve">Phiên bản 7.1.1 (09/07/2026): trung lập hóa lớp cấu hình mô hình (</w:t>
+      </w:r>
+      <w:r>
+        <w:rPr>
+          <w:rStyle w:val="VerbatimChar"/>
+        </w:rPr>
+        <w:t xml:space="preserve">LLM_PROVIDER</w:t>
+      </w:r>
+      <w:r>
+        <w:t xml:space="preserve">/</w:t>
+      </w:r>
+      <w:r>
+        <w:rPr>
+          <w:rStyle w:val="VerbatimChar"/>
+        </w:rPr>
+        <w:t xml:space="preserve">LLM_API_KEY</w:t>
+      </w:r>
+      <w:r>
+        <w:t xml:space="preserve">/</w:t>
+      </w:r>
+      <w:r>
+        <w:rPr>
+          <w:rStyle w:val="VerbatimChar"/>
+        </w:rPr>
+        <w:t xml:space="preserve">LLM_MODEL</w:t>
+      </w:r>
+      <w:r>
+        <w:t xml:space="preserve">), đồng bộ siêu dữ liệu và tài liệu. Trước đó: 7.1.0 (thêm đóng gói pip PEP 621, bộ kiểm thử pytest, chuyển frontend sang Vite 6, CI GitHub Actions); 7.0.1 (10/06/2026, căn chỉnh schema với cơ sở dữ liệu P6). Chi tiết trong</w:t>
       </w:r>
       <w:r>
         <w:t xml:space="preserve"> </w:t>
@@ -728,7 +755,37 @@
         </w:numPr>
       </w:pPr>
       <w:r>
-        <w:t xml:space="preserve">Trích dẫn theo</w:t>
+        <w:t xml:space="preserve">Lưu trữ Zenodo với DOI: concept</w:t>
+      </w:r>
+      <w:r>
+        <w:t xml:space="preserve"> </w:t>
+      </w:r>
+      <w:r>
+        <w:rPr>
+          <w:rStyle w:val="VerbatimChar"/>
+        </w:rPr>
+        <w:t xml:space="preserve">10.5281/zenodo.21282516</w:t>
+      </w:r>
+      <w:r>
+        <w:t xml:space="preserve"> </w:t>
+      </w:r>
+      <w:r>
+        <w:t xml:space="preserve">(mọi phiên bản) và version</w:t>
+      </w:r>
+      <w:r>
+        <w:t xml:space="preserve"> </w:t>
+      </w:r>
+      <w:r>
+        <w:rPr>
+          <w:rStyle w:val="VerbatimChar"/>
+        </w:rPr>
+        <w:t xml:space="preserve">10.5281/zenodo.21282517</w:t>
+      </w:r>
+      <w:r>
+        <w:t xml:space="preserve"> </w:t>
+      </w:r>
+      <w:r>
+        <w:t xml:space="preserve">(bản v7.1.1). Trích dẫn theo</w:t>
       </w:r>
       <w:r>
         <w:t xml:space="preserve"> </w:t>
@@ -740,7 +797,7 @@
         <w:t xml:space="preserve">CITATION.cff</w:t>
       </w:r>
       <w:r>
-        <w:t xml:space="preserve">; siêu dữ liệu Zenodo có sẵn trong</w:t>
+        <w:t xml:space="preserve">; siêu dữ liệu Zenodo trong</w:t>
       </w:r>
       <w:r>
         <w:t xml:space="preserve"> </w:t>
@@ -752,37 +809,7 @@
         <w:t xml:space="preserve">.zenodo.json</w:t>
       </w:r>
       <w:r>
-        <w:t xml:space="preserve">. Quy trình phát hành lấy DOI Zenodo: xem</w:t>
-      </w:r>
-      <w:r>
-        <w:t xml:space="preserve"> </w:t>
-      </w:r>
-      <w:r>
-        <w:rPr>
-          <w:rStyle w:val="VerbatimChar"/>
-        </w:rPr>
-        <w:t xml:space="preserve">PUBLISHING.md</w:t>
-      </w:r>
-      <w:r>
-        <w:t xml:space="preserve"> </w:t>
-      </w:r>
-      <w:r>
-        <w:t xml:space="preserve">(sau khi có DOI, điền vào badge trong</w:t>
-      </w:r>
-      <w:r>
-        <w:t xml:space="preserve"> </w:t>
-      </w:r>
-      <w:r>
-        <w:rPr>
-          <w:rStyle w:val="VerbatimChar"/>
-        </w:rPr>
-        <w:t xml:space="preserve">README.md</w:t>
-      </w:r>
-      <w:r>
-        <w:t xml:space="preserve"> </w:t>
-      </w:r>
-      <w:r>
-        <w:t xml:space="preserve">và vào mục khai báo M-AIDA trong bản thảo P6 nếu cần).</w:t>
+        <w:t xml:space="preserve">.</w:t>
       </w:r>
     </w:p>
     <w:p>
@@ -794,7 +821,19 @@
         </w:numPr>
       </w:pPr>
       <w:r>
-        <w:t xml:space="preserve">Giấy phép: Academic Source-Available (xem</w:t>
+        <w:t xml:space="preserve">Kho công khai:</w:t>
+      </w:r>
+      <w:r>
+        <w:t xml:space="preserve"> </w:t>
+      </w:r>
+      <w:r>
+        <w:rPr>
+          <w:rStyle w:val="VerbatimChar"/>
+        </w:rPr>
+        <w:t xml:space="preserve">https://github.com/thuyhuongctu/M-AIDA</w:t>
+      </w:r>
+      <w:r>
+        <w:t xml:space="preserve">. Giấy phép: Academic Source-Available (xem</w:t>
       </w:r>
       <w:r>
         <w:t xml:space="preserve"> </w:t>
@@ -867,7 +906,7 @@
         </w:numPr>
       </w:pPr>
       <w:r>
-        <w:t xml:space="preserve">Không có dấu gạch dài trong tài liệu (README, CHANGELOG, PUBLISHING đã làm sạch).</w:t>
+        <w:t xml:space="preserve">Không có dấu gạch dài trong tài liệu và mã nguồn.</w:t>
       </w:r>
     </w:p>
     <w:p>
@@ -879,7 +918,7 @@
         </w:numPr>
       </w:pPr>
       <w:r>
-        <w:t xml:space="preserve">Phiên bản thống nhất 7.1.0 ở</w:t>
+        <w:t xml:space="preserve">Phiên bản thống nhất 7.1.1 ở</w:t>
       </w:r>
       <w:r>
         <w:t xml:space="preserve"> </w:t>
@@ -915,7 +954,10 @@
         <w:t xml:space="preserve">.zenodo.json</w:t>
       </w:r>
       <w:r>
-        <w:t xml:space="preserve">.</w:t>
+        <w:t xml:space="preserve"> </w:t>
+      </w:r>
+      <w:r>
+        <w:t xml:space="preserve">và mã nguồn.</w:t>
       </w:r>
     </w:p>
     <w:bookmarkEnd w:id="15"/>

</xml_diff>